<commit_message>
Lab document update Spring 2026
</commit_message>
<xml_diff>
--- a/Lab03.docx
+++ b/Lab03.docx
@@ -1,6 +1,6 @@
 
 <file path=word/document.xml><?xml version="1.0" encoding="utf-8"?>
-<w:document xmlns:wpc="http://schemas.microsoft.com/office/word/2010/wordprocessingCanvas" xmlns:cx="http://schemas.microsoft.com/office/drawing/2014/chartex" xmlns:cx1="http://schemas.microsoft.com/office/drawing/2015/9/8/chartex" xmlns:cx2="http://schemas.microsoft.com/office/drawing/2015/10/21/chartex" xmlns:cx3="http://schemas.microsoft.com/office/drawing/2016/5/9/chartex" xmlns:cx4="http://schemas.microsoft.com/office/drawing/2016/5/10/chartex" xmlns:cx5="http://schemas.microsoft.com/office/drawing/2016/5/11/chartex" xmlns:cx6="http://schemas.microsoft.com/office/drawing/2016/5/12/chartex" xmlns:cx7="http://schemas.microsoft.com/office/drawing/2016/5/13/chartex" xmlns:cx8="http://schemas.microsoft.com/office/drawing/2016/5/14/chartex" xmlns:mc="http://schemas.openxmlformats.org/markup-compatibility/2006" xmlns:aink="http://schemas.microsoft.com/office/drawing/2016/ink" xmlns:am3d="http://schemas.microsoft.com/office/drawing/2017/model3d" xmlns:o="urn:schemas-microsoft-com:office:office" xmlns:oel="http://schemas.microsoft.com/office/2019/extlst" xmlns:r="http://schemas.openxmlformats.org/officeDocument/2006/relationships" xmlns:m="http://schemas.openxmlformats.org/officeDocument/2006/math" xmlns:v="urn:schemas-microsoft-com:vml" xmlns:wp14="http://schemas.microsoft.com/office/word/2010/wordprocessingDrawing" xmlns:wp="http://schemas.openxmlformats.org/drawingml/2006/wordprocessingDrawing" xmlns:w10="urn:schemas-microsoft-com:office:word" xmlns:w="http://schemas.openxmlformats.org/wordprocessingml/2006/main" xmlns:w14="http://schemas.microsoft.com/office/word/2010/wordml" xmlns:w15="http://schemas.microsoft.com/office/word/2012/wordml" xmlns:w16cex="http://schemas.microsoft.com/office/word/2018/wordml/cex" xmlns:w16cid="http://schemas.microsoft.com/office/word/2016/wordml/cid" xmlns:w16="http://schemas.microsoft.com/office/word/2018/wordml" xmlns:w16du="http://schemas.microsoft.com/office/word/2023/wordml/word16du" xmlns:w16sdtdh="http://schemas.microsoft.com/office/word/2020/wordml/sdtdatahash" xmlns:w16se="http://schemas.microsoft.com/office/word/2015/wordml/symex" xmlns:wpg="http://schemas.microsoft.com/office/word/2010/wordprocessingGroup" xmlns:wpi="http://schemas.microsoft.com/office/word/2010/wordprocessingInk" xmlns:wne="http://schemas.microsoft.com/office/word/2006/wordml" xmlns:wps="http://schemas.microsoft.com/office/word/2010/wordprocessingShape" mc:Ignorable="w14 w15 w16se w16cid w16 w16cex w16sdtdh w16du wp14">
+<w:document xmlns:wpc="http://schemas.microsoft.com/office/word/2010/wordprocessingCanvas" xmlns:cx="http://schemas.microsoft.com/office/drawing/2014/chartex" xmlns:cx1="http://schemas.microsoft.com/office/drawing/2015/9/8/chartex" xmlns:cx2="http://schemas.microsoft.com/office/drawing/2015/10/21/chartex" xmlns:cx3="http://schemas.microsoft.com/office/drawing/2016/5/9/chartex" xmlns:cx4="http://schemas.microsoft.com/office/drawing/2016/5/10/chartex" xmlns:cx5="http://schemas.microsoft.com/office/drawing/2016/5/11/chartex" xmlns:cx6="http://schemas.microsoft.com/office/drawing/2016/5/12/chartex" xmlns:cx7="http://schemas.microsoft.com/office/drawing/2016/5/13/chartex" xmlns:cx8="http://schemas.microsoft.com/office/drawing/2016/5/14/chartex" xmlns:mc="http://schemas.openxmlformats.org/markup-compatibility/2006" xmlns:aink="http://schemas.microsoft.com/office/drawing/2016/ink" xmlns:am3d="http://schemas.microsoft.com/office/drawing/2017/model3d" xmlns:o="urn:schemas-microsoft-com:office:office" xmlns:oel="http://schemas.microsoft.com/office/2019/extlst" xmlns:r="http://schemas.openxmlformats.org/officeDocument/2006/relationships" xmlns:m="http://schemas.openxmlformats.org/officeDocument/2006/math" xmlns:v="urn:schemas-microsoft-com:vml" xmlns:wp14="http://schemas.microsoft.com/office/word/2010/wordprocessingDrawing" xmlns:wp="http://schemas.openxmlformats.org/drawingml/2006/wordprocessingDrawing" xmlns:w10="urn:schemas-microsoft-com:office:word" xmlns:w="http://schemas.openxmlformats.org/wordprocessingml/2006/main" xmlns:w14="http://schemas.microsoft.com/office/word/2010/wordml" xmlns:w15="http://schemas.microsoft.com/office/word/2012/wordml" xmlns:w16cex="http://schemas.microsoft.com/office/word/2018/wordml/cex" xmlns:w16cid="http://schemas.microsoft.com/office/word/2016/wordml/cid" xmlns:w16="http://schemas.microsoft.com/office/word/2018/wordml" xmlns:w16du="http://schemas.microsoft.com/office/word/2023/wordml/word16du" xmlns:w16sdtdh="http://schemas.microsoft.com/office/word/2020/wordml/sdtdatahash" xmlns:w16sdtfl="http://schemas.microsoft.com/office/word/2024/wordml/sdtformatlock" xmlns:w16se="http://schemas.microsoft.com/office/word/2015/wordml/symex" xmlns:wpg="http://schemas.microsoft.com/office/word/2010/wordprocessingGroup" xmlns:wpi="http://schemas.microsoft.com/office/word/2010/wordprocessingInk" xmlns:wne="http://schemas.microsoft.com/office/word/2006/wordml" xmlns:wps="http://schemas.microsoft.com/office/word/2010/wordprocessingShape" mc:Ignorable="w14 w15 w16se w16cid w16 w16cex w16sdtdh w16sdtfl w16du wp14">
   <w:body>
     <w:p>
       <w:pPr>
@@ -1618,8 +1618,24 @@
           <w:rFonts w:ascii="Times New Roman" w:eastAsia="Times New Roman" w:hAnsi="Times New Roman" w:cs="Times New Roman"/>
         </w:rPr>
       </w:pPr>
-      <w:r>
-        <w:t>Valvano Section 3.3 on software style</w:t>
+      <w:hyperlink r:id="rId9" w:anchor="2_8" w:history="1">
+        <w:proofErr w:type="spellStart"/>
+        <w:r>
+          <w:rPr>
+            <w:rStyle w:val="Hyperlink"/>
+          </w:rPr>
+          <w:t>ebook</w:t>
+        </w:r>
+        <w:proofErr w:type="spellEnd"/>
+        <w:r>
+          <w:rPr>
+            <w:rStyle w:val="Hyperlink"/>
+          </w:rPr>
+          <w:t xml:space="preserve"> Section 2.8</w:t>
+        </w:r>
+      </w:hyperlink>
+      <w:r>
+        <w:t xml:space="preserve"> or textbook Valvano Section 5.3 on critical sections</w:t>
       </w:r>
     </w:p>
     <w:p>
@@ -1640,10 +1656,49 @@
           <w:rFonts w:ascii="Times New Roman" w:eastAsia="Times New Roman" w:hAnsi="Times New Roman" w:cs="Times New Roman"/>
         </w:rPr>
       </w:pPr>
-      <w:r>
-        <w:t>Valvano Section 3.4 on developing modular software</w:t>
-      </w:r>
-    </w:p>
+      <w:hyperlink r:id="rId10" w:anchor="3_2" w:history="1">
+        <w:proofErr w:type="spellStart"/>
+        <w:r>
+          <w:rPr>
+            <w:rStyle w:val="Hyperlink"/>
+          </w:rPr>
+          <w:t>ebook</w:t>
+        </w:r>
+        <w:proofErr w:type="spellEnd"/>
+        <w:r>
+          <w:rPr>
+            <w:rStyle w:val="Hyperlink"/>
+          </w:rPr>
+          <w:t xml:space="preserve"> Sections 3.2</w:t>
+        </w:r>
+      </w:hyperlink>
+      <w:r>
+        <w:t xml:space="preserve"> </w:t>
+      </w:r>
+      <w:hyperlink r:id="rId11" w:anchor="3_5" w:history="1">
+        <w:r>
+          <w:rPr>
+            <w:rStyle w:val="Hyperlink"/>
+          </w:rPr>
+          <w:t>3.5</w:t>
+        </w:r>
+      </w:hyperlink>
+      <w:r>
+        <w:t xml:space="preserve"> </w:t>
+      </w:r>
+      <w:hyperlink r:id="rId12" w:anchor="3_6" w:history="1">
+        <w:r>
+          <w:rPr>
+            <w:rStyle w:val="Hyperlink"/>
+          </w:rPr>
+          <w:t>3.6</w:t>
+        </w:r>
+      </w:hyperlink>
+      <w:r>
+        <w:t xml:space="preserve"> or textbook Sections 4.5, 4.9, 5.5 on edge-triggered LCD, buzzer</w:t>
+      </w:r>
+    </w:p>
+    <w:bookmarkStart w:id="4" w:name="_Hlk202079108"/>
     <w:p>
       <w:pPr>
         <w:pStyle w:val="ListParagraph"/>
@@ -1663,9 +1718,57 @@
         </w:rPr>
       </w:pPr>
       <w:r>
-        <w:t>Valvano Chapter 4 on Basic Handshake Mechanisms,</w:t>
-      </w:r>
-    </w:p>
+        <w:fldChar w:fldCharType="begin"/>
+      </w:r>
+      <w:r>
+        <w:instrText>HYPERLINK "https://users.ece.utexas.edu/~valvano/EE445L/ebook/Chapter3_HumanInterfaces.htm#3_7"</w:instrText>
+      </w:r>
+      <w:r>
+        <w:fldChar w:fldCharType="separate"/>
+      </w:r>
+      <w:proofErr w:type="spellStart"/>
+      <w:r>
+        <w:rPr>
+          <w:rStyle w:val="Hyperlink"/>
+        </w:rPr>
+        <w:t>ebook</w:t>
+      </w:r>
+      <w:proofErr w:type="spellEnd"/>
+      <w:r>
+        <w:rPr>
+          <w:rStyle w:val="Hyperlink"/>
+        </w:rPr>
+        <w:t xml:space="preserve"> Section </w:t>
+      </w:r>
+      <w:r>
+        <w:rPr>
+          <w:rStyle w:val="Hyperlink"/>
+        </w:rPr>
+        <w:t>3</w:t>
+      </w:r>
+      <w:r>
+        <w:rPr>
+          <w:rStyle w:val="Hyperlink"/>
+        </w:rPr>
+        <w:t>.</w:t>
+      </w:r>
+      <w:r>
+        <w:rPr>
+          <w:rStyle w:val="Hyperlink"/>
+        </w:rPr>
+        <w:t>7</w:t>
+      </w:r>
+      <w:r>
+        <w:fldChar w:fldCharType="end"/>
+      </w:r>
+      <w:r>
+        <w:t xml:space="preserve"> or textbook</w:t>
+      </w:r>
+      <w:r>
+        <w:t xml:space="preserve"> Section 3.4 on developing modular software</w:t>
+      </w:r>
+    </w:p>
+    <w:bookmarkEnd w:id="4"/>
     <w:p>
       <w:pPr>
         <w:pStyle w:val="ListParagraph"/>
@@ -1685,21 +1788,36 @@
         </w:rPr>
       </w:pPr>
       <w:r>
-        <w:t>Valvano Sections 4.5</w:t>
-      </w:r>
-      <w:r>
-        <w:t xml:space="preserve">, </w:t>
-      </w:r>
-      <w:r>
-        <w:t>4.9</w:t>
-      </w:r>
-      <w:r>
-        <w:t>, 5.5</w:t>
-      </w:r>
-      <w:r>
-        <w:t xml:space="preserve"> on edge-triggered interrupts and the LCD</w:t>
-      </w:r>
-    </w:p>
+        <w:fldChar w:fldCharType="begin"/>
+      </w:r>
+      <w:r>
+        <w:instrText>HYPERLINK "https://users.ece.utexas.edu/~valvano/EE445L/ebook/Chapter3_HumanInterfaces.htm#3_8"</w:instrText>
+      </w:r>
+      <w:r>
+        <w:fldChar w:fldCharType="separate"/>
+      </w:r>
+      <w:proofErr w:type="spellStart"/>
+      <w:r>
+        <w:rPr>
+          <w:rStyle w:val="Hyperlink"/>
+        </w:rPr>
+        <w:t>ebook</w:t>
+      </w:r>
+      <w:proofErr w:type="spellEnd"/>
+      <w:r>
+        <w:rPr>
+          <w:rStyle w:val="Hyperlink"/>
+        </w:rPr>
+        <w:t xml:space="preserve"> Section 3.8</w:t>
+      </w:r>
+      <w:r>
+        <w:fldChar w:fldCharType="end"/>
+      </w:r>
+      <w:r>
+        <w:t xml:space="preserve"> or textbook Section 3.3 on software style</w:t>
+      </w:r>
+    </w:p>
+    <w:bookmarkStart w:id="5" w:name="_Hlk202077876"/>
     <w:p>
       <w:pPr>
         <w:pStyle w:val="ListParagraph"/>
@@ -1719,7 +1837,45 @@
         </w:rPr>
       </w:pPr>
       <w:r>
-        <w:t>Valvano Section 5.7 and 6.2 on periodic interrupts</w:t>
+        <w:fldChar w:fldCharType="begin"/>
+      </w:r>
+      <w:r>
+        <w:instrText>HYPERLINK "https://users.ece.utexas.edu/~valvano/EE445L/ebook/TM4C123.htm#T_3"</w:instrText>
+      </w:r>
+      <w:r>
+        <w:fldChar w:fldCharType="separate"/>
+      </w:r>
+      <w:proofErr w:type="spellStart"/>
+      <w:r>
+        <w:rPr>
+          <w:rStyle w:val="Hyperlink"/>
+        </w:rPr>
+        <w:t>ebook</w:t>
+      </w:r>
+      <w:proofErr w:type="spellEnd"/>
+      <w:r>
+        <w:rPr>
+          <w:rStyle w:val="Hyperlink"/>
+        </w:rPr>
+        <w:t xml:space="preserve"> Section T.3</w:t>
+      </w:r>
+      <w:r>
+        <w:fldChar w:fldCharType="end"/>
+      </w:r>
+      <w:r>
+        <w:t xml:space="preserve"> </w:t>
+      </w:r>
+      <w:r>
+        <w:t>or textbook</w:t>
+      </w:r>
+      <w:r>
+        <w:t xml:space="preserve"> Section 6.2 on periodic</w:t>
+      </w:r>
+      <w:r>
+        <w:t xml:space="preserve"> timer</w:t>
+      </w:r>
+      <w:r>
+        <w:t xml:space="preserve"> interrupts</w:t>
       </w:r>
     </w:p>
     <w:p>
@@ -1732,11 +1888,12 @@
           <w:szCs w:val="22"/>
         </w:rPr>
       </w:pPr>
-      <w:bookmarkStart w:id="4" w:name="_Toc157175615"/>
+      <w:bookmarkStart w:id="6" w:name="_Toc157175615"/>
+      <w:bookmarkEnd w:id="5"/>
       <w:r>
         <w:t>Starter Files</w:t>
       </w:r>
-      <w:bookmarkEnd w:id="4"/>
+      <w:bookmarkEnd w:id="6"/>
     </w:p>
     <w:p>
       <w:pPr>
@@ -1791,11 +1948,11 @@
           <w:color w:val="FF0000"/>
         </w:rPr>
       </w:pPr>
-      <w:bookmarkStart w:id="5" w:name="_Toc157175616"/>
+      <w:bookmarkStart w:id="7" w:name="_Toc157175616"/>
       <w:r>
         <w:t>Required Hardware</w:t>
       </w:r>
-      <w:bookmarkEnd w:id="5"/>
+      <w:bookmarkEnd w:id="7"/>
     </w:p>
     <w:tbl>
       <w:tblPr>
@@ -1892,7 +2049,7 @@
             <w:tcW w:w="2820" w:type="dxa"/>
           </w:tcPr>
           <w:p>
-            <w:hyperlink r:id="rId9">
+            <w:hyperlink r:id="rId13">
               <w:r>
                 <w:rPr>
                   <w:color w:val="0563C1"/>
@@ -1947,7 +2104,7 @@
           </w:p>
           <w:p>
             <w:r>
-              <w:t>or SSD1306 OLED</w:t>
+              <w:t>Adafruit or HiLetGo</w:t>
             </w:r>
           </w:p>
         </w:tc>
@@ -1956,7 +2113,7 @@
             <w:tcW w:w="2820" w:type="dxa"/>
           </w:tcPr>
           <w:p>
-            <w:hyperlink r:id="rId10">
+            <w:hyperlink r:id="rId14">
               <w:r>
                 <w:rPr>
                   <w:color w:val="1155CC"/>
@@ -1976,11 +2133,7 @@
               <w:t>$19.95</w:t>
             </w:r>
           </w:p>
-          <w:p>
-            <w:r>
-              <w:t>$3.00</w:t>
-            </w:r>
-          </w:p>
+          <w:p/>
         </w:tc>
         <w:tc>
           <w:tcPr>
@@ -1992,20 +2145,26 @@
                 <w:b/>
               </w:rPr>
             </w:pPr>
-            <w:r>
-              <w:rPr>
-                <w:b/>
-              </w:rPr>
-              <w:t>Adafruit</w:t>
-            </w:r>
+            <w:hyperlink r:id="rId15" w:history="1">
+              <w:r>
+                <w:rPr>
+                  <w:rStyle w:val="Hyperlink"/>
+                  <w:b/>
+                </w:rPr>
+                <w:t>Adafruit</w:t>
+              </w:r>
+            </w:hyperlink>
           </w:p>
           <w:p>
-            <w:r>
-              <w:rPr>
-                <w:b/>
-              </w:rPr>
-              <w:t>Amazon</w:t>
-            </w:r>
+            <w:hyperlink r:id="rId16" w:history="1">
+              <w:r>
+                <w:rPr>
+                  <w:rStyle w:val="Hyperlink"/>
+                  <w:b/>
+                </w:rPr>
+                <w:t>Amazon</w:t>
+              </w:r>
+            </w:hyperlink>
           </w:p>
         </w:tc>
       </w:tr>
@@ -2214,7 +2373,7 @@
             <w:tcW w:w="2820" w:type="dxa"/>
           </w:tcPr>
           <w:p>
-            <w:hyperlink r:id="rId11">
+            <w:hyperlink r:id="rId17">
               <w:r>
                 <w:rPr>
                   <w:color w:val="1155CC"/>
@@ -2225,7 +2384,7 @@
             </w:hyperlink>
           </w:p>
           <w:p>
-            <w:hyperlink r:id="rId12">
+            <w:hyperlink r:id="rId18">
               <w:r>
                 <w:rPr>
                   <w:color w:val="1155CC"/>
@@ -2292,7 +2451,7 @@
             <w:tcW w:w="2820" w:type="dxa"/>
           </w:tcPr>
           <w:p>
-            <w:hyperlink r:id="rId13">
+            <w:hyperlink r:id="rId19">
               <w:r>
                 <w:rPr>
                   <w:color w:val="1155CC"/>
@@ -2343,11 +2502,11 @@
           <w:color w:val="FF0000"/>
         </w:rPr>
       </w:pPr>
-      <w:bookmarkStart w:id="6" w:name="_Toc157175617"/>
+      <w:bookmarkStart w:id="8" w:name="_Toc157175617"/>
       <w:r>
         <w:t>Lab Overview</w:t>
       </w:r>
-      <w:bookmarkEnd w:id="6"/>
+      <w:bookmarkEnd w:id="8"/>
     </w:p>
     <w:p>
       <w:pPr>
@@ -2416,11 +2575,11 @@
       <w:pPr>
         <w:pStyle w:val="Heading2"/>
       </w:pPr>
-      <w:bookmarkStart w:id="7" w:name="_Toc157175618"/>
+      <w:bookmarkStart w:id="9" w:name="_Toc157175618"/>
       <w:r>
         <w:t>Requirements Document</w:t>
       </w:r>
-      <w:bookmarkEnd w:id="7"/>
+      <w:bookmarkEnd w:id="9"/>
     </w:p>
     <w:p>
       <w:pPr>
@@ -2454,11 +2613,11 @@
       <w:pPr>
         <w:pStyle w:val="Heading1"/>
       </w:pPr>
-      <w:bookmarkStart w:id="8" w:name="_Toc157175619"/>
+      <w:bookmarkStart w:id="10" w:name="_Toc157175619"/>
       <w:r>
         <w:t>Preparation</w:t>
       </w:r>
-      <w:bookmarkEnd w:id="8"/>
+      <w:bookmarkEnd w:id="10"/>
     </w:p>
     <w:p>
       <w:pPr>
@@ -2642,7 +2801,7 @@
                     <pic:cNvPicPr preferRelativeResize="0"/>
                   </pic:nvPicPr>
                   <pic:blipFill>
-                    <a:blip r:embed="rId14"/>
+                    <a:blip r:embed="rId20"/>
                     <a:srcRect/>
                     <a:stretch>
                       <a:fillRect/>
@@ -2755,7 +2914,7 @@
                     <pic:cNvPicPr preferRelativeResize="0"/>
                   </pic:nvPicPr>
                   <pic:blipFill>
-                    <a:blip r:embed="rId15"/>
+                    <a:blip r:embed="rId21"/>
                     <a:srcRect/>
                     <a:stretch>
                       <a:fillRect/>
@@ -2952,11 +3111,11 @@
       <w:pPr>
         <w:pStyle w:val="Heading1"/>
       </w:pPr>
-      <w:bookmarkStart w:id="9" w:name="_Toc157175620"/>
+      <w:bookmarkStart w:id="11" w:name="_Toc157175620"/>
       <w:r>
         <w:t>Procedure</w:t>
       </w:r>
-      <w:bookmarkEnd w:id="9"/>
+      <w:bookmarkEnd w:id="11"/>
     </w:p>
     <w:p>
       <w:pPr>
@@ -2977,15 +3136,7 @@
         </w:rPr>
       </w:pPr>
       <w:r>
-        <w:t xml:space="preserve">Build and test any external hardware needed. Debug each module separately. Debug the overall alarm clock. Measure how long it takes to update the graphical time on the LCD. Identify all shared I/O ports and global variables. I.e., document in your software all the permanently allocated variables that have read or write access by more than one thread. Next, consider what would happen if the </w:t>
-      </w:r>
-      <w:proofErr w:type="gramStart"/>
-      <w:r>
-        <w:t>interrupt</w:t>
-      </w:r>
-      <w:proofErr w:type="gramEnd"/>
-      <w:r>
-        <w:t xml:space="preserve"> occurred between any two instructions of the main program. Remember high priority interrupts can suspend lower priority ISRs. Look for critical sections, and if you find any remove them. Document in your software that each shared object is not critical. During checkout, the TA may ask you to prove that your system has no critical sections.) </w:t>
+        <w:t xml:space="preserve">Build and test any external hardware needed. Debug each module separately. Debug the overall alarm clock. Measure how long it takes to update the graphical time on the LCD. Identify all shared I/O ports and global variables. I.e., document in your software all the permanently allocated variables that have read or write access by more than one thread. Next, consider what would happen if the interrupt occurred between any two instructions of the main program. Remember high priority interrupts can suspend lower priority ISRs. Look for critical sections, and if you find any remove them. Document in your software that each shared object is not critical. During checkout, the TA may ask you to prove that your system has no critical sections.) </w:t>
       </w:r>
     </w:p>
     <w:p>
@@ -3125,9 +3276,9 @@
           <w:iCs/>
         </w:rPr>
       </w:pPr>
-      <w:bookmarkStart w:id="10" w:name="_heading=h.510n82qj5yvo" w:colFirst="0" w:colLast="0"/>
-      <w:bookmarkStart w:id="11" w:name="_Toc145397264"/>
-      <w:bookmarkEnd w:id="10"/>
+      <w:bookmarkStart w:id="12" w:name="_heading=h.510n82qj5yvo" w:colFirst="0" w:colLast="0"/>
+      <w:bookmarkStart w:id="13" w:name="_Toc145397264"/>
+      <w:bookmarkEnd w:id="12"/>
       <w:r>
         <w:rPr>
           <w:iCs/>
@@ -3191,7 +3342,7 @@
                     <pic:cNvPicPr preferRelativeResize="0"/>
                   </pic:nvPicPr>
                   <pic:blipFill>
-                    <a:blip r:embed="rId16"/>
+                    <a:blip r:embed="rId22"/>
                     <a:srcRect/>
                     <a:stretch>
                       <a:fillRect/>
@@ -3213,7 +3364,7 @@
           </wp:inline>
         </w:drawing>
       </w:r>
-      <w:bookmarkEnd w:id="11"/>
+      <w:bookmarkEnd w:id="13"/>
     </w:p>
     <w:p>
       <w:pPr>
@@ -3286,7 +3437,7 @@
                     <pic:cNvPicPr preferRelativeResize="0"/>
                   </pic:nvPicPr>
                   <pic:blipFill>
-                    <a:blip r:embed="rId17"/>
+                    <a:blip r:embed="rId23"/>
                     <a:srcRect/>
                     <a:stretch>
                       <a:fillRect/>
@@ -3385,7 +3536,7 @@
                     <pic:cNvPicPr preferRelativeResize="0"/>
                   </pic:nvPicPr>
                   <pic:blipFill>
-                    <a:blip r:embed="rId18"/>
+                    <a:blip r:embed="rId24"/>
                     <a:srcRect/>
                     <a:stretch>
                       <a:fillRect/>
@@ -3458,7 +3609,7 @@
                     <pic:cNvPicPr preferRelativeResize="0"/>
                   </pic:nvPicPr>
                   <pic:blipFill>
-                    <a:blip r:embed="rId19"/>
+                    <a:blip r:embed="rId25"/>
                     <a:srcRect/>
                     <a:stretch>
                       <a:fillRect/>
@@ -3482,6 +3633,14 @@
       </w:r>
     </w:p>
     <w:p>
+      <w:r>
+        <w:rPr>
+          <w:i/>
+        </w:rPr>
+        <w:t>Figure 3.3d. Scope trace of the voltage on the speaker with 10k at gate and a 1N914 snubber diode across the speaker.</w:t>
+      </w:r>
+    </w:p>
+    <w:p>
       <w:pPr>
         <w:numPr>
           <w:ilvl w:val="0"/>
@@ -3525,7 +3684,7 @@
                     <pic:cNvPicPr preferRelativeResize="0"/>
                   </pic:nvPicPr>
                   <pic:blipFill>
-                    <a:blip r:embed="rId20"/>
+                    <a:blip r:embed="rId26"/>
                     <a:srcRect/>
                     <a:stretch>
                       <a:fillRect/>
@@ -3583,11 +3742,11 @@
       <w:pPr>
         <w:pStyle w:val="Heading2"/>
       </w:pPr>
-      <w:bookmarkStart w:id="12" w:name="_Toc157175621"/>
+      <w:bookmarkStart w:id="14" w:name="_Toc157175621"/>
       <w:r>
         <w:t>Deliverable 1</w:t>
       </w:r>
-      <w:bookmarkEnd w:id="12"/>
+      <w:bookmarkEnd w:id="14"/>
     </w:p>
     <w:p>
       <w:r>
@@ -3598,11 +3757,11 @@
       <w:pPr>
         <w:pStyle w:val="Heading2"/>
       </w:pPr>
-      <w:bookmarkStart w:id="13" w:name="_Toc157175622"/>
+      <w:bookmarkStart w:id="15" w:name="_Toc157175622"/>
       <w:r>
         <w:t>Deliverable 2</w:t>
       </w:r>
-      <w:bookmarkEnd w:id="13"/>
+      <w:bookmarkEnd w:id="15"/>
     </w:p>
     <w:p>
       <w:r>
@@ -3613,11 +3772,11 @@
       <w:pPr>
         <w:pStyle w:val="Heading2"/>
       </w:pPr>
-      <w:bookmarkStart w:id="14" w:name="_Toc157175623"/>
+      <w:bookmarkStart w:id="16" w:name="_Toc157175623"/>
       <w:r>
         <w:t>Deliverable 3</w:t>
       </w:r>
-      <w:bookmarkEnd w:id="14"/>
+      <w:bookmarkEnd w:id="16"/>
     </w:p>
     <w:p>
       <w:r>
@@ -3640,12 +3799,12 @@
       <w:pPr>
         <w:pStyle w:val="Heading2"/>
       </w:pPr>
-      <w:bookmarkStart w:id="15" w:name="_Toc157175624"/>
+      <w:bookmarkStart w:id="17" w:name="_Toc157175624"/>
       <w:r>
         <w:lastRenderedPageBreak/>
         <w:t>Deliverable 4</w:t>
       </w:r>
-      <w:bookmarkEnd w:id="15"/>
+      <w:bookmarkEnd w:id="17"/>
     </w:p>
     <w:p>
       <w:r>
@@ -3665,11 +3824,11 @@
       <w:pPr>
         <w:pStyle w:val="Heading2"/>
       </w:pPr>
-      <w:bookmarkStart w:id="16" w:name="_Toc157175625"/>
+      <w:bookmarkStart w:id="18" w:name="_Toc157175625"/>
       <w:r>
         <w:t>Deliverable 5</w:t>
       </w:r>
-      <w:bookmarkEnd w:id="16"/>
+      <w:bookmarkEnd w:id="18"/>
     </w:p>
     <w:p>
       <w:r>
@@ -3698,29 +3857,21 @@
       <w:pPr>
         <w:pStyle w:val="Heading2"/>
       </w:pPr>
-      <w:bookmarkStart w:id="17" w:name="_Toc157175626"/>
+      <w:bookmarkStart w:id="19" w:name="_Toc157175626"/>
       <w:r>
         <w:t>Deliverable 6</w:t>
       </w:r>
-      <w:bookmarkEnd w:id="17"/>
+      <w:bookmarkEnd w:id="19"/>
     </w:p>
     <w:p>
       <w:r>
         <w:t>Show the system current with and without the alarm sounding.</w:t>
       </w:r>
       <w:r>
-        <w:t xml:space="preserve"> This is measuring the current through the entire system. You can do this by </w:t>
-      </w:r>
-      <w:proofErr w:type="gramStart"/>
-      <w:r>
-        <w:t xml:space="preserve">connecting </w:t>
-      </w:r>
-      <w:r>
-        <w:t xml:space="preserve"> the</w:t>
-      </w:r>
-      <w:proofErr w:type="gramEnd"/>
-      <w:r>
-        <w:t xml:space="preserve"> lab </w:t>
+        <w:t xml:space="preserve"> This is measuring the current through the entire system. You can do this by connecting </w:t>
+      </w:r>
+      <w:r>
+        <w:t xml:space="preserve"> the lab </w:t>
       </w:r>
       <w:r>
         <w:t xml:space="preserve">DC power supply (set to 5V and 500mA) to the TM4C’s VBUS and GND.  </w:t>
@@ -3730,11 +3881,11 @@
       <w:pPr>
         <w:pStyle w:val="Heading1"/>
       </w:pPr>
-      <w:bookmarkStart w:id="18" w:name="_Toc157175627"/>
+      <w:bookmarkStart w:id="20" w:name="_Toc157175627"/>
       <w:r>
         <w:t>Lab Checkout</w:t>
       </w:r>
-      <w:bookmarkEnd w:id="18"/>
+      <w:bookmarkEnd w:id="20"/>
     </w:p>
     <w:p>
       <w:pPr>
@@ -3764,11 +3915,11 @@
       <w:pPr>
         <w:pStyle w:val="Heading1"/>
       </w:pPr>
-      <w:bookmarkStart w:id="19" w:name="_Toc157175628"/>
+      <w:bookmarkStart w:id="21" w:name="_Toc157175628"/>
       <w:r>
         <w:t>Lab Report</w:t>
       </w:r>
-      <w:bookmarkEnd w:id="19"/>
+      <w:bookmarkEnd w:id="21"/>
     </w:p>
     <w:p>
       <w:pPr>
@@ -3801,11 +3952,11 @@
       <w:pPr>
         <w:pStyle w:val="Heading1"/>
       </w:pPr>
-      <w:bookmarkStart w:id="20" w:name="_Toc157175629"/>
+      <w:bookmarkStart w:id="22" w:name="_Toc157175629"/>
       <w:r>
         <w:t>Hints</w:t>
       </w:r>
-      <w:bookmarkEnd w:id="20"/>
+      <w:bookmarkEnd w:id="22"/>
     </w:p>
     <w:p>
       <w:pPr>
@@ -3843,15 +3994,7 @@
         <w:t>Ω resistor</w:t>
       </w:r>
       <w:r>
-        <w:t xml:space="preserve"> between digital output pin and gate reduces current surges but does not affect loudness. Loudness is determined by the voltage drop across the speaker. Connect the source to ground, and </w:t>
-      </w:r>
-      <w:proofErr w:type="gramStart"/>
-      <w:r>
-        <w:t>the drain</w:t>
-      </w:r>
-      <w:proofErr w:type="gramEnd"/>
-      <w:r>
-        <w:t xml:space="preserve"> to one side of the speaker. Connect the other side to +3.3V. The maximum </w:t>
+        <w:t xml:space="preserve"> between digital output pin and gate reduces current surges but does not affect loudness. Loudness is determined by the voltage drop across the speaker. Connect the source to ground, and the drain to one side of the speaker. Connect the other side to +3.3V. The maximum </w:t>
       </w:r>
       <m:oMath>
         <m:sSub>
@@ -3960,7 +4103,13 @@
         </w:numPr>
       </w:pPr>
       <w:r>
-        <w:t>If you use edge-triggered interrupts, build an analog filter to debounce each switch. Set R1=0, and R2=100k to create the negative logic switch. Choose R2 and C1 so the time constant (τ=R2*C1) is around 10 ms. Test the circuit with a scope before connecting to the microcontroller.</w:t>
+        <w:t>If you use edge-triggered interrupts, build an analog filter to debounce each switch. Set R1=</w:t>
+      </w:r>
+      <w:r>
+        <w:t>100</w:t>
+      </w:r>
+      <w:r>
+        <w:t>, and R2=100k to create the negative logic switch. Choose R2 and C1 so the time constant (τ=R2*C1) is around 10 ms. Test the circuit with a scope before connecting to the microcontroller.</w:t>
       </w:r>
     </w:p>
     <w:p>
@@ -3972,9 +4121,9 @@
           <w:noProof/>
         </w:rPr>
         <w:drawing>
-          <wp:inline distT="114300" distB="114300" distL="114300" distR="114300" wp14:anchorId="5804E6C6" wp14:editId="07777777">
-            <wp:extent cx="5943600" cy="3162300"/>
-            <wp:effectExtent l="0" t="0" r="0" b="0"/>
+          <wp:inline distT="114300" distB="114300" distL="114300" distR="114300" wp14:anchorId="5804E6C6" wp14:editId="0F6F1B12">
+            <wp:extent cx="2682875" cy="1597025"/>
+            <wp:effectExtent l="0" t="0" r="3175" b="3175"/>
             <wp:docPr id="2025201115" name="image4.png"/>
             <wp:cNvGraphicFramePr/>
             <a:graphic xmlns:a="http://schemas.openxmlformats.org/drawingml/2006/main">
@@ -3985,7 +4134,7 @@
                     <pic:cNvPicPr preferRelativeResize="0"/>
                   </pic:nvPicPr>
                   <pic:blipFill>
-                    <a:blip r:embed="rId21"/>
+                    <a:blip r:embed="rId27"/>
                     <a:srcRect/>
                     <a:stretch>
                       <a:fillRect/>
@@ -3994,7 +4143,7 @@
                   <pic:spPr>
                     <a:xfrm>
                       <a:off x="0" y="0"/>
-                      <a:ext cx="5943600" cy="3162300"/>
+                      <a:ext cx="2682875" cy="1597025"/>
                     </a:xfrm>
                     <a:prstGeom prst="rect">
                       <a:avLst/>
@@ -4007,17 +4156,117 @@
           </wp:inline>
         </w:drawing>
       </w:r>
-    </w:p>
-    <w:p>
+      <w:r>
+        <w:t xml:space="preserve">         </w:t>
+      </w:r>
       <w:r>
         <w:rPr>
           <w:noProof/>
         </w:rPr>
-        <w:lastRenderedPageBreak/>
         <w:drawing>
-          <wp:inline distT="114300" distB="114300" distL="114300" distR="114300" wp14:anchorId="19109D2B" wp14:editId="07777777">
-            <wp:extent cx="5943600" cy="2984500"/>
-            <wp:effectExtent l="0" t="0" r="0" b="0"/>
+          <wp:inline distT="0" distB="0" distL="0" distR="0" wp14:anchorId="37298B84" wp14:editId="0DE40B12">
+            <wp:extent cx="1898650" cy="1533525"/>
+            <wp:effectExtent l="0" t="0" r="6350" b="9525"/>
+            <wp:docPr id="1553031751" name="Picture 1"/>
+            <wp:cNvGraphicFramePr>
+              <a:graphicFrameLocks xmlns:a="http://schemas.openxmlformats.org/drawingml/2006/main" noChangeAspect="1"/>
+            </wp:cNvGraphicFramePr>
+            <a:graphic xmlns:a="http://schemas.openxmlformats.org/drawingml/2006/main">
+              <a:graphicData uri="http://schemas.openxmlformats.org/drawingml/2006/picture">
+                <pic:pic xmlns:pic="http://schemas.openxmlformats.org/drawingml/2006/picture">
+                  <pic:nvPicPr>
+                    <pic:cNvPr id="0" name="Picture 1"/>
+                    <pic:cNvPicPr>
+                      <a:picLocks noChangeAspect="1" noChangeArrowheads="1"/>
+                    </pic:cNvPicPr>
+                  </pic:nvPicPr>
+                  <pic:blipFill>
+                    <a:blip r:embed="rId28">
+                      <a:extLst>
+                        <a:ext uri="{28A0092B-C50C-407E-A947-70E740481C1C}">
+                          <a14:useLocalDpi xmlns:a14="http://schemas.microsoft.com/office/drawing/2010/main" val="0"/>
+                        </a:ext>
+                      </a:extLst>
+                    </a:blip>
+                    <a:srcRect/>
+                    <a:stretch>
+                      <a:fillRect/>
+                    </a:stretch>
+                  </pic:blipFill>
+                  <pic:spPr bwMode="auto">
+                    <a:xfrm>
+                      <a:off x="0" y="0"/>
+                      <a:ext cx="1898650" cy="1533525"/>
+                    </a:xfrm>
+                    <a:prstGeom prst="rect">
+                      <a:avLst/>
+                    </a:prstGeom>
+                    <a:noFill/>
+                    <a:ln>
+                      <a:noFill/>
+                    </a:ln>
+                  </pic:spPr>
+                </pic:pic>
+              </a:graphicData>
+            </a:graphic>
+          </wp:inline>
+        </w:drawing>
+      </w:r>
+    </w:p>
+    <w:p>
+      <w:pPr>
+        <w:ind w:left="720"/>
+        <w:jc w:val="center"/>
+        <w:rPr>
+          <w:i/>
+          <w:iCs/>
+        </w:rPr>
+      </w:pPr>
+      <w:r>
+        <w:rPr>
+          <w:i/>
+          <w:iCs/>
+        </w:rPr>
+        <w:t>Figure 3.</w:t>
+      </w:r>
+      <w:r>
+        <w:rPr>
+          <w:i/>
+          <w:iCs/>
+        </w:rPr>
+        <w:t>5</w:t>
+      </w:r>
+      <w:r>
+        <w:rPr>
+          <w:i/>
+          <w:iCs/>
+        </w:rPr>
+        <w:t xml:space="preserve">. </w:t>
+      </w:r>
+      <w:r>
+        <w:rPr>
+          <w:i/>
+          <w:iCs/>
+        </w:rPr>
+        <w:t>Switch debouncing with a capacitor</w:t>
+      </w:r>
+      <w:r>
+        <w:rPr>
+          <w:i/>
+          <w:iCs/>
+        </w:rPr>
+        <w:t>.</w:t>
+      </w:r>
+    </w:p>
+    <w:p>
+      <w:r>
+        <w:rPr>
+          <w:noProof/>
+        </w:rPr>
+        <w:drawing>
+          <wp:inline distT="114300" distB="114300" distL="114300" distR="114300" wp14:anchorId="19109D2B" wp14:editId="35959206">
+            <wp:extent cx="5495925" cy="2720975"/>
+            <wp:effectExtent l="0" t="0" r="9525" b="3175"/>
             <wp:docPr id="2025201118" name="image9.png"/>
             <wp:cNvGraphicFramePr/>
             <a:graphic xmlns:a="http://schemas.openxmlformats.org/drawingml/2006/main">
@@ -4028,7 +4277,7 @@
                     <pic:cNvPicPr preferRelativeResize="0"/>
                   </pic:nvPicPr>
                   <pic:blipFill>
-                    <a:blip r:embed="rId22"/>
+                    <a:blip r:embed="rId29"/>
                     <a:srcRect/>
                     <a:stretch>
                       <a:fillRect/>
@@ -4037,7 +4286,7 @@
                   <pic:spPr>
                     <a:xfrm>
                       <a:off x="0" y="0"/>
-                      <a:ext cx="5943600" cy="2984500"/>
+                      <a:ext cx="5495925" cy="2720975"/>
                     </a:xfrm>
                     <a:prstGeom prst="rect">
                       <a:avLst/>
@@ -4053,6 +4302,52 @@
     </w:p>
     <w:p>
       <w:pPr>
+        <w:ind w:left="720"/>
+        <w:jc w:val="center"/>
+        <w:rPr>
+          <w:i/>
+          <w:iCs/>
+        </w:rPr>
+      </w:pPr>
+      <w:r>
+        <w:rPr>
+          <w:i/>
+          <w:iCs/>
+        </w:rPr>
+        <w:t>Figure 3.</w:t>
+      </w:r>
+      <w:r>
+        <w:rPr>
+          <w:i/>
+          <w:iCs/>
+        </w:rPr>
+        <w:t>6</w:t>
+      </w:r>
+      <w:r>
+        <w:rPr>
+          <w:i/>
+          <w:iCs/>
+        </w:rPr>
+        <w:t xml:space="preserve">. </w:t>
+      </w:r>
+      <w:r>
+        <w:rPr>
+          <w:i/>
+          <w:iCs/>
+        </w:rPr>
+        <w:t>Waveform for negative logic switch interface</w:t>
+      </w:r>
+      <w:r>
+        <w:rPr>
+          <w:i/>
+          <w:iCs/>
+        </w:rPr>
+        <w:t>.</w:t>
+      </w:r>
+    </w:p>
+    <w:p/>
+    <w:p>
+      <w:pPr>
         <w:numPr>
           <w:ilvl w:val="0"/>
           <w:numId w:val="4"/>
@@ -4073,8 +4368,12 @@
       </w:r>
     </w:p>
     <w:sectPr>
-      <w:headerReference w:type="default" r:id="rId23"/>
-      <w:footerReference w:type="default" r:id="rId24"/>
+      <w:headerReference w:type="even" r:id="rId30"/>
+      <w:headerReference w:type="default" r:id="rId31"/>
+      <w:footerReference w:type="even" r:id="rId32"/>
+      <w:footerReference w:type="default" r:id="rId33"/>
+      <w:headerReference w:type="first" r:id="rId34"/>
+      <w:footerReference w:type="first" r:id="rId35"/>
       <w:pgSz w:w="12240" w:h="15840"/>
       <w:pgMar w:top="1440" w:right="1440" w:bottom="1440" w:left="1440" w:header="720" w:footer="720" w:gutter="0"/>
       <w:pgNumType w:start="1"/>
@@ -4085,7 +4384,7 @@
 </file>
 
 <file path=word/endnotes.xml><?xml version="1.0" encoding="utf-8"?>
-<w:endnotes xmlns:wpc="http://schemas.microsoft.com/office/word/2010/wordprocessingCanvas" xmlns:cx="http://schemas.microsoft.com/office/drawing/2014/chartex" xmlns:cx1="http://schemas.microsoft.com/office/drawing/2015/9/8/chartex" xmlns:cx2="http://schemas.microsoft.com/office/drawing/2015/10/21/chartex" xmlns:cx3="http://schemas.microsoft.com/office/drawing/2016/5/9/chartex" xmlns:cx4="http://schemas.microsoft.com/office/drawing/2016/5/10/chartex" xmlns:cx5="http://schemas.microsoft.com/office/drawing/2016/5/11/chartex" xmlns:cx6="http://schemas.microsoft.com/office/drawing/2016/5/12/chartex" xmlns:cx7="http://schemas.microsoft.com/office/drawing/2016/5/13/chartex" xmlns:cx8="http://schemas.microsoft.com/office/drawing/2016/5/14/chartex" xmlns:mc="http://schemas.openxmlformats.org/markup-compatibility/2006" xmlns:aink="http://schemas.microsoft.com/office/drawing/2016/ink" xmlns:am3d="http://schemas.microsoft.com/office/drawing/2017/model3d" xmlns:o="urn:schemas-microsoft-com:office:office" xmlns:oel="http://schemas.microsoft.com/office/2019/extlst" xmlns:r="http://schemas.openxmlformats.org/officeDocument/2006/relationships" xmlns:m="http://schemas.openxmlformats.org/officeDocument/2006/math" xmlns:v="urn:schemas-microsoft-com:vml" xmlns:wp14="http://schemas.microsoft.com/office/word/2010/wordprocessingDrawing" xmlns:wp="http://schemas.openxmlformats.org/drawingml/2006/wordprocessingDrawing" xmlns:w10="urn:schemas-microsoft-com:office:word" xmlns:w="http://schemas.openxmlformats.org/wordprocessingml/2006/main" xmlns:w14="http://schemas.microsoft.com/office/word/2010/wordml" xmlns:w15="http://schemas.microsoft.com/office/word/2012/wordml" xmlns:w16cex="http://schemas.microsoft.com/office/word/2018/wordml/cex" xmlns:w16cid="http://schemas.microsoft.com/office/word/2016/wordml/cid" xmlns:w16="http://schemas.microsoft.com/office/word/2018/wordml" xmlns:w16du="http://schemas.microsoft.com/office/word/2023/wordml/word16du" xmlns:w16sdtdh="http://schemas.microsoft.com/office/word/2020/wordml/sdtdatahash" xmlns:w16se="http://schemas.microsoft.com/office/word/2015/wordml/symex" xmlns:wpg="http://schemas.microsoft.com/office/word/2010/wordprocessingGroup" xmlns:wpi="http://schemas.microsoft.com/office/word/2010/wordprocessingInk" xmlns:wne="http://schemas.microsoft.com/office/word/2006/wordml" xmlns:wps="http://schemas.microsoft.com/office/word/2010/wordprocessingShape" mc:Ignorable="w14 w15 w16se w16cid w16 w16cex w16sdtdh w16du wp14">
+<w:endnotes xmlns:wpc="http://schemas.microsoft.com/office/word/2010/wordprocessingCanvas" xmlns:cx="http://schemas.microsoft.com/office/drawing/2014/chartex" xmlns:cx1="http://schemas.microsoft.com/office/drawing/2015/9/8/chartex" xmlns:cx2="http://schemas.microsoft.com/office/drawing/2015/10/21/chartex" xmlns:cx3="http://schemas.microsoft.com/office/drawing/2016/5/9/chartex" xmlns:cx4="http://schemas.microsoft.com/office/drawing/2016/5/10/chartex" xmlns:cx5="http://schemas.microsoft.com/office/drawing/2016/5/11/chartex" xmlns:cx6="http://schemas.microsoft.com/office/drawing/2016/5/12/chartex" xmlns:cx7="http://schemas.microsoft.com/office/drawing/2016/5/13/chartex" xmlns:cx8="http://schemas.microsoft.com/office/drawing/2016/5/14/chartex" xmlns:mc="http://schemas.openxmlformats.org/markup-compatibility/2006" xmlns:aink="http://schemas.microsoft.com/office/drawing/2016/ink" xmlns:am3d="http://schemas.microsoft.com/office/drawing/2017/model3d" xmlns:o="urn:schemas-microsoft-com:office:office" xmlns:oel="http://schemas.microsoft.com/office/2019/extlst" xmlns:r="http://schemas.openxmlformats.org/officeDocument/2006/relationships" xmlns:m="http://schemas.openxmlformats.org/officeDocument/2006/math" xmlns:v="urn:schemas-microsoft-com:vml" xmlns:wp14="http://schemas.microsoft.com/office/word/2010/wordprocessingDrawing" xmlns:wp="http://schemas.openxmlformats.org/drawingml/2006/wordprocessingDrawing" xmlns:w10="urn:schemas-microsoft-com:office:word" xmlns:w="http://schemas.openxmlformats.org/wordprocessingml/2006/main" xmlns:w14="http://schemas.microsoft.com/office/word/2010/wordml" xmlns:w15="http://schemas.microsoft.com/office/word/2012/wordml" xmlns:w16cex="http://schemas.microsoft.com/office/word/2018/wordml/cex" xmlns:w16cid="http://schemas.microsoft.com/office/word/2016/wordml/cid" xmlns:w16="http://schemas.microsoft.com/office/word/2018/wordml" xmlns:w16du="http://schemas.microsoft.com/office/word/2023/wordml/word16du" xmlns:w16sdtdh="http://schemas.microsoft.com/office/word/2020/wordml/sdtdatahash" xmlns:w16sdtfl="http://schemas.microsoft.com/office/word/2024/wordml/sdtformatlock" xmlns:w16se="http://schemas.microsoft.com/office/word/2015/wordml/symex" xmlns:wpg="http://schemas.microsoft.com/office/word/2010/wordprocessingGroup" xmlns:wpi="http://schemas.microsoft.com/office/word/2010/wordprocessingInk" xmlns:wne="http://schemas.microsoft.com/office/word/2006/wordml" xmlns:wps="http://schemas.microsoft.com/office/word/2010/wordprocessingShape" mc:Ignorable="w14 w15 w16se w16cid w16 w16cex w16sdtdh w16sdtfl w16du wp14">
   <w:endnote w:type="separator" w:id="-1">
     <w:p>
       <w:pPr>
@@ -4110,7 +4409,17 @@
 </file>
 
 <file path=word/footer1.xml><?xml version="1.0" encoding="utf-8"?>
-<w:ftr xmlns:wpc="http://schemas.microsoft.com/office/word/2010/wordprocessingCanvas" xmlns:cx="http://schemas.microsoft.com/office/drawing/2014/chartex" xmlns:cx1="http://schemas.microsoft.com/office/drawing/2015/9/8/chartex" xmlns:cx2="http://schemas.microsoft.com/office/drawing/2015/10/21/chartex" xmlns:cx3="http://schemas.microsoft.com/office/drawing/2016/5/9/chartex" xmlns:cx4="http://schemas.microsoft.com/office/drawing/2016/5/10/chartex" xmlns:cx5="http://schemas.microsoft.com/office/drawing/2016/5/11/chartex" xmlns:cx6="http://schemas.microsoft.com/office/drawing/2016/5/12/chartex" xmlns:cx7="http://schemas.microsoft.com/office/drawing/2016/5/13/chartex" xmlns:cx8="http://schemas.microsoft.com/office/drawing/2016/5/14/chartex" xmlns:mc="http://schemas.openxmlformats.org/markup-compatibility/2006" xmlns:aink="http://schemas.microsoft.com/office/drawing/2016/ink" xmlns:am3d="http://schemas.microsoft.com/office/drawing/2017/model3d" xmlns:o="urn:schemas-microsoft-com:office:office" xmlns:oel="http://schemas.microsoft.com/office/2019/extlst" xmlns:r="http://schemas.openxmlformats.org/officeDocument/2006/relationships" xmlns:m="http://schemas.openxmlformats.org/officeDocument/2006/math" xmlns:v="urn:schemas-microsoft-com:vml" xmlns:wp14="http://schemas.microsoft.com/office/word/2010/wordprocessingDrawing" xmlns:wp="http://schemas.openxmlformats.org/drawingml/2006/wordprocessingDrawing" xmlns:w10="urn:schemas-microsoft-com:office:word" xmlns:w="http://schemas.openxmlformats.org/wordprocessingml/2006/main" xmlns:w14="http://schemas.microsoft.com/office/word/2010/wordml" xmlns:w15="http://schemas.microsoft.com/office/word/2012/wordml" xmlns:w16cex="http://schemas.microsoft.com/office/word/2018/wordml/cex" xmlns:w16cid="http://schemas.microsoft.com/office/word/2016/wordml/cid" xmlns:w16="http://schemas.microsoft.com/office/word/2018/wordml" xmlns:w16du="http://schemas.microsoft.com/office/word/2023/wordml/word16du" xmlns:w16sdtdh="http://schemas.microsoft.com/office/word/2020/wordml/sdtdatahash" xmlns:w16se="http://schemas.microsoft.com/office/word/2015/wordml/symex" xmlns:wpg="http://schemas.microsoft.com/office/word/2010/wordprocessingGroup" xmlns:wpi="http://schemas.microsoft.com/office/word/2010/wordprocessingInk" xmlns:wne="http://schemas.microsoft.com/office/word/2006/wordml" xmlns:wps="http://schemas.microsoft.com/office/word/2010/wordprocessingShape" mc:Ignorable="w14 w15 w16se w16cid w16 w16cex w16sdtdh w16du wp14">
+<w:ftr xmlns:wpc="http://schemas.microsoft.com/office/word/2010/wordprocessingCanvas" xmlns:cx="http://schemas.microsoft.com/office/drawing/2014/chartex" xmlns:cx1="http://schemas.microsoft.com/office/drawing/2015/9/8/chartex" xmlns:cx2="http://schemas.microsoft.com/office/drawing/2015/10/21/chartex" xmlns:cx3="http://schemas.microsoft.com/office/drawing/2016/5/9/chartex" xmlns:cx4="http://schemas.microsoft.com/office/drawing/2016/5/10/chartex" xmlns:cx5="http://schemas.microsoft.com/office/drawing/2016/5/11/chartex" xmlns:cx6="http://schemas.microsoft.com/office/drawing/2016/5/12/chartex" xmlns:cx7="http://schemas.microsoft.com/office/drawing/2016/5/13/chartex" xmlns:cx8="http://schemas.microsoft.com/office/drawing/2016/5/14/chartex" xmlns:mc="http://schemas.openxmlformats.org/markup-compatibility/2006" xmlns:aink="http://schemas.microsoft.com/office/drawing/2016/ink" xmlns:am3d="http://schemas.microsoft.com/office/drawing/2017/model3d" xmlns:o="urn:schemas-microsoft-com:office:office" xmlns:oel="http://schemas.microsoft.com/office/2019/extlst" xmlns:r="http://schemas.openxmlformats.org/officeDocument/2006/relationships" xmlns:m="http://schemas.openxmlformats.org/officeDocument/2006/math" xmlns:v="urn:schemas-microsoft-com:vml" xmlns:wp14="http://schemas.microsoft.com/office/word/2010/wordprocessingDrawing" xmlns:wp="http://schemas.openxmlformats.org/drawingml/2006/wordprocessingDrawing" xmlns:w10="urn:schemas-microsoft-com:office:word" xmlns:w="http://schemas.openxmlformats.org/wordprocessingml/2006/main" xmlns:w14="http://schemas.microsoft.com/office/word/2010/wordml" xmlns:w15="http://schemas.microsoft.com/office/word/2012/wordml" xmlns:w16cex="http://schemas.microsoft.com/office/word/2018/wordml/cex" xmlns:w16cid="http://schemas.microsoft.com/office/word/2016/wordml/cid" xmlns:w16="http://schemas.microsoft.com/office/word/2018/wordml" xmlns:w16du="http://schemas.microsoft.com/office/word/2023/wordml/word16du" xmlns:w16sdtdh="http://schemas.microsoft.com/office/word/2020/wordml/sdtdatahash" xmlns:w16sdtfl="http://schemas.microsoft.com/office/word/2024/wordml/sdtformatlock" xmlns:w16se="http://schemas.microsoft.com/office/word/2015/wordml/symex" xmlns:wpg="http://schemas.microsoft.com/office/word/2010/wordprocessingGroup" xmlns:wpi="http://schemas.microsoft.com/office/word/2010/wordprocessingInk" xmlns:wne="http://schemas.microsoft.com/office/word/2006/wordml" xmlns:wps="http://schemas.microsoft.com/office/word/2010/wordprocessingShape" mc:Ignorable="w14 w15 w16se w16cid w16 w16cex w16sdtdh w16sdtfl w16du wp14">
+  <w:p>
+    <w:pPr>
+      <w:pStyle w:val="Footer"/>
+    </w:pPr>
+  </w:p>
+</w:ftr>
+</file>
+
+<file path=word/footer2.xml><?xml version="1.0" encoding="utf-8"?>
+<w:ftr xmlns:wpc="http://schemas.microsoft.com/office/word/2010/wordprocessingCanvas" xmlns:cx="http://schemas.microsoft.com/office/drawing/2014/chartex" xmlns:cx1="http://schemas.microsoft.com/office/drawing/2015/9/8/chartex" xmlns:cx2="http://schemas.microsoft.com/office/drawing/2015/10/21/chartex" xmlns:cx3="http://schemas.microsoft.com/office/drawing/2016/5/9/chartex" xmlns:cx4="http://schemas.microsoft.com/office/drawing/2016/5/10/chartex" xmlns:cx5="http://schemas.microsoft.com/office/drawing/2016/5/11/chartex" xmlns:cx6="http://schemas.microsoft.com/office/drawing/2016/5/12/chartex" xmlns:cx7="http://schemas.microsoft.com/office/drawing/2016/5/13/chartex" xmlns:cx8="http://schemas.microsoft.com/office/drawing/2016/5/14/chartex" xmlns:mc="http://schemas.openxmlformats.org/markup-compatibility/2006" xmlns:aink="http://schemas.microsoft.com/office/drawing/2016/ink" xmlns:am3d="http://schemas.microsoft.com/office/drawing/2017/model3d" xmlns:o="urn:schemas-microsoft-com:office:office" xmlns:oel="http://schemas.microsoft.com/office/2019/extlst" xmlns:r="http://schemas.openxmlformats.org/officeDocument/2006/relationships" xmlns:m="http://schemas.openxmlformats.org/officeDocument/2006/math" xmlns:v="urn:schemas-microsoft-com:vml" xmlns:wp14="http://schemas.microsoft.com/office/word/2010/wordprocessingDrawing" xmlns:wp="http://schemas.openxmlformats.org/drawingml/2006/wordprocessingDrawing" xmlns:w10="urn:schemas-microsoft-com:office:word" xmlns:w="http://schemas.openxmlformats.org/wordprocessingml/2006/main" xmlns:w14="http://schemas.microsoft.com/office/word/2010/wordml" xmlns:w15="http://schemas.microsoft.com/office/word/2012/wordml" xmlns:w16cex="http://schemas.microsoft.com/office/word/2018/wordml/cex" xmlns:w16cid="http://schemas.microsoft.com/office/word/2016/wordml/cid" xmlns:w16="http://schemas.microsoft.com/office/word/2018/wordml" xmlns:w16du="http://schemas.microsoft.com/office/word/2023/wordml/word16du" xmlns:w16sdtdh="http://schemas.microsoft.com/office/word/2020/wordml/sdtdatahash" xmlns:w16sdtfl="http://schemas.microsoft.com/office/word/2024/wordml/sdtformatlock" xmlns:w16se="http://schemas.microsoft.com/office/word/2015/wordml/symex" xmlns:wpg="http://schemas.microsoft.com/office/word/2010/wordprocessingGroup" xmlns:wpi="http://schemas.microsoft.com/office/word/2010/wordprocessingInk" xmlns:wne="http://schemas.microsoft.com/office/word/2006/wordml" xmlns:wps="http://schemas.microsoft.com/office/word/2010/wordprocessingShape" mc:Ignorable="w14 w15 w16se w16cid w16 w16cex w16sdtdh w16sdtfl w16du wp14">
   <w:p>
     <w:pPr>
       <w:widowControl w:val="0"/>
@@ -4271,8 +4580,18 @@
 </w:ftr>
 </file>
 
+<file path=word/footer3.xml><?xml version="1.0" encoding="utf-8"?>
+<w:ftr xmlns:wpc="http://schemas.microsoft.com/office/word/2010/wordprocessingCanvas" xmlns:cx="http://schemas.microsoft.com/office/drawing/2014/chartex" xmlns:cx1="http://schemas.microsoft.com/office/drawing/2015/9/8/chartex" xmlns:cx2="http://schemas.microsoft.com/office/drawing/2015/10/21/chartex" xmlns:cx3="http://schemas.microsoft.com/office/drawing/2016/5/9/chartex" xmlns:cx4="http://schemas.microsoft.com/office/drawing/2016/5/10/chartex" xmlns:cx5="http://schemas.microsoft.com/office/drawing/2016/5/11/chartex" xmlns:cx6="http://schemas.microsoft.com/office/drawing/2016/5/12/chartex" xmlns:cx7="http://schemas.microsoft.com/office/drawing/2016/5/13/chartex" xmlns:cx8="http://schemas.microsoft.com/office/drawing/2016/5/14/chartex" xmlns:mc="http://schemas.openxmlformats.org/markup-compatibility/2006" xmlns:aink="http://schemas.microsoft.com/office/drawing/2016/ink" xmlns:am3d="http://schemas.microsoft.com/office/drawing/2017/model3d" xmlns:o="urn:schemas-microsoft-com:office:office" xmlns:oel="http://schemas.microsoft.com/office/2019/extlst" xmlns:r="http://schemas.openxmlformats.org/officeDocument/2006/relationships" xmlns:m="http://schemas.openxmlformats.org/officeDocument/2006/math" xmlns:v="urn:schemas-microsoft-com:vml" xmlns:wp14="http://schemas.microsoft.com/office/word/2010/wordprocessingDrawing" xmlns:wp="http://schemas.openxmlformats.org/drawingml/2006/wordprocessingDrawing" xmlns:w10="urn:schemas-microsoft-com:office:word" xmlns:w="http://schemas.openxmlformats.org/wordprocessingml/2006/main" xmlns:w14="http://schemas.microsoft.com/office/word/2010/wordml" xmlns:w15="http://schemas.microsoft.com/office/word/2012/wordml" xmlns:w16cex="http://schemas.microsoft.com/office/word/2018/wordml/cex" xmlns:w16cid="http://schemas.microsoft.com/office/word/2016/wordml/cid" xmlns:w16="http://schemas.microsoft.com/office/word/2018/wordml" xmlns:w16du="http://schemas.microsoft.com/office/word/2023/wordml/word16du" xmlns:w16sdtdh="http://schemas.microsoft.com/office/word/2020/wordml/sdtdatahash" xmlns:w16sdtfl="http://schemas.microsoft.com/office/word/2024/wordml/sdtformatlock" xmlns:w16se="http://schemas.microsoft.com/office/word/2015/wordml/symex" xmlns:wpg="http://schemas.microsoft.com/office/word/2010/wordprocessingGroup" xmlns:wpi="http://schemas.microsoft.com/office/word/2010/wordprocessingInk" xmlns:wne="http://schemas.microsoft.com/office/word/2006/wordml" xmlns:wps="http://schemas.microsoft.com/office/word/2010/wordprocessingShape" mc:Ignorable="w14 w15 w16se w16cid w16 w16cex w16sdtdh w16sdtfl w16du wp14">
+  <w:p>
+    <w:pPr>
+      <w:pStyle w:val="Footer"/>
+    </w:pPr>
+  </w:p>
+</w:ftr>
+</file>
+
 <file path=word/footnotes.xml><?xml version="1.0" encoding="utf-8"?>
-<w:footnotes xmlns:wpc="http://schemas.microsoft.com/office/word/2010/wordprocessingCanvas" xmlns:cx="http://schemas.microsoft.com/office/drawing/2014/chartex" xmlns:cx1="http://schemas.microsoft.com/office/drawing/2015/9/8/chartex" xmlns:cx2="http://schemas.microsoft.com/office/drawing/2015/10/21/chartex" xmlns:cx3="http://schemas.microsoft.com/office/drawing/2016/5/9/chartex" xmlns:cx4="http://schemas.microsoft.com/office/drawing/2016/5/10/chartex" xmlns:cx5="http://schemas.microsoft.com/office/drawing/2016/5/11/chartex" xmlns:cx6="http://schemas.microsoft.com/office/drawing/2016/5/12/chartex" xmlns:cx7="http://schemas.microsoft.com/office/drawing/2016/5/13/chartex" xmlns:cx8="http://schemas.microsoft.com/office/drawing/2016/5/14/chartex" xmlns:mc="http://schemas.openxmlformats.org/markup-compatibility/2006" xmlns:aink="http://schemas.microsoft.com/office/drawing/2016/ink" xmlns:am3d="http://schemas.microsoft.com/office/drawing/2017/model3d" xmlns:o="urn:schemas-microsoft-com:office:office" xmlns:oel="http://schemas.microsoft.com/office/2019/extlst" xmlns:r="http://schemas.openxmlformats.org/officeDocument/2006/relationships" xmlns:m="http://schemas.openxmlformats.org/officeDocument/2006/math" xmlns:v="urn:schemas-microsoft-com:vml" xmlns:wp14="http://schemas.microsoft.com/office/word/2010/wordprocessingDrawing" xmlns:wp="http://schemas.openxmlformats.org/drawingml/2006/wordprocessingDrawing" xmlns:w10="urn:schemas-microsoft-com:office:word" xmlns:w="http://schemas.openxmlformats.org/wordprocessingml/2006/main" xmlns:w14="http://schemas.microsoft.com/office/word/2010/wordml" xmlns:w15="http://schemas.microsoft.com/office/word/2012/wordml" xmlns:w16cex="http://schemas.microsoft.com/office/word/2018/wordml/cex" xmlns:w16cid="http://schemas.microsoft.com/office/word/2016/wordml/cid" xmlns:w16="http://schemas.microsoft.com/office/word/2018/wordml" xmlns:w16du="http://schemas.microsoft.com/office/word/2023/wordml/word16du" xmlns:w16sdtdh="http://schemas.microsoft.com/office/word/2020/wordml/sdtdatahash" xmlns:w16se="http://schemas.microsoft.com/office/word/2015/wordml/symex" xmlns:wpg="http://schemas.microsoft.com/office/word/2010/wordprocessingGroup" xmlns:wpi="http://schemas.microsoft.com/office/word/2010/wordprocessingInk" xmlns:wne="http://schemas.microsoft.com/office/word/2006/wordml" xmlns:wps="http://schemas.microsoft.com/office/word/2010/wordprocessingShape" mc:Ignorable="w14 w15 w16se w16cid w16 w16cex w16sdtdh w16du wp14">
+<w:footnotes xmlns:wpc="http://schemas.microsoft.com/office/word/2010/wordprocessingCanvas" xmlns:cx="http://schemas.microsoft.com/office/drawing/2014/chartex" xmlns:cx1="http://schemas.microsoft.com/office/drawing/2015/9/8/chartex" xmlns:cx2="http://schemas.microsoft.com/office/drawing/2015/10/21/chartex" xmlns:cx3="http://schemas.microsoft.com/office/drawing/2016/5/9/chartex" xmlns:cx4="http://schemas.microsoft.com/office/drawing/2016/5/10/chartex" xmlns:cx5="http://schemas.microsoft.com/office/drawing/2016/5/11/chartex" xmlns:cx6="http://schemas.microsoft.com/office/drawing/2016/5/12/chartex" xmlns:cx7="http://schemas.microsoft.com/office/drawing/2016/5/13/chartex" xmlns:cx8="http://schemas.microsoft.com/office/drawing/2016/5/14/chartex" xmlns:mc="http://schemas.openxmlformats.org/markup-compatibility/2006" xmlns:aink="http://schemas.microsoft.com/office/drawing/2016/ink" xmlns:am3d="http://schemas.microsoft.com/office/drawing/2017/model3d" xmlns:o="urn:schemas-microsoft-com:office:office" xmlns:oel="http://schemas.microsoft.com/office/2019/extlst" xmlns:r="http://schemas.openxmlformats.org/officeDocument/2006/relationships" xmlns:m="http://schemas.openxmlformats.org/officeDocument/2006/math" xmlns:v="urn:schemas-microsoft-com:vml" xmlns:wp14="http://schemas.microsoft.com/office/word/2010/wordprocessingDrawing" xmlns:wp="http://schemas.openxmlformats.org/drawingml/2006/wordprocessingDrawing" xmlns:w10="urn:schemas-microsoft-com:office:word" xmlns:w="http://schemas.openxmlformats.org/wordprocessingml/2006/main" xmlns:w14="http://schemas.microsoft.com/office/word/2010/wordml" xmlns:w15="http://schemas.microsoft.com/office/word/2012/wordml" xmlns:w16cex="http://schemas.microsoft.com/office/word/2018/wordml/cex" xmlns:w16cid="http://schemas.microsoft.com/office/word/2016/wordml/cid" xmlns:w16="http://schemas.microsoft.com/office/word/2018/wordml" xmlns:w16du="http://schemas.microsoft.com/office/word/2023/wordml/word16du" xmlns:w16sdtdh="http://schemas.microsoft.com/office/word/2020/wordml/sdtdatahash" xmlns:w16sdtfl="http://schemas.microsoft.com/office/word/2024/wordml/sdtformatlock" xmlns:w16se="http://schemas.microsoft.com/office/word/2015/wordml/symex" xmlns:wpg="http://schemas.microsoft.com/office/word/2010/wordprocessingGroup" xmlns:wpi="http://schemas.microsoft.com/office/word/2010/wordprocessingInk" xmlns:wne="http://schemas.microsoft.com/office/word/2006/wordml" xmlns:wps="http://schemas.microsoft.com/office/word/2010/wordprocessingShape" mc:Ignorable="w14 w15 w16se w16cid w16 w16cex w16sdtdh w16sdtfl w16du wp14">
   <w:footnote w:type="separator" w:id="-1">
     <w:p>
       <w:pPr>
@@ -4297,7 +4616,17 @@
 </file>
 
 <file path=word/header1.xml><?xml version="1.0" encoding="utf-8"?>
-<w:hdr xmlns:wpc="http://schemas.microsoft.com/office/word/2010/wordprocessingCanvas" xmlns:cx="http://schemas.microsoft.com/office/drawing/2014/chartex" xmlns:cx1="http://schemas.microsoft.com/office/drawing/2015/9/8/chartex" xmlns:cx2="http://schemas.microsoft.com/office/drawing/2015/10/21/chartex" xmlns:cx3="http://schemas.microsoft.com/office/drawing/2016/5/9/chartex" xmlns:cx4="http://schemas.microsoft.com/office/drawing/2016/5/10/chartex" xmlns:cx5="http://schemas.microsoft.com/office/drawing/2016/5/11/chartex" xmlns:cx6="http://schemas.microsoft.com/office/drawing/2016/5/12/chartex" xmlns:cx7="http://schemas.microsoft.com/office/drawing/2016/5/13/chartex" xmlns:cx8="http://schemas.microsoft.com/office/drawing/2016/5/14/chartex" xmlns:mc="http://schemas.openxmlformats.org/markup-compatibility/2006" xmlns:aink="http://schemas.microsoft.com/office/drawing/2016/ink" xmlns:am3d="http://schemas.microsoft.com/office/drawing/2017/model3d" xmlns:o="urn:schemas-microsoft-com:office:office" xmlns:oel="http://schemas.microsoft.com/office/2019/extlst" xmlns:r="http://schemas.openxmlformats.org/officeDocument/2006/relationships" xmlns:m="http://schemas.openxmlformats.org/officeDocument/2006/math" xmlns:v="urn:schemas-microsoft-com:vml" xmlns:wp14="http://schemas.microsoft.com/office/word/2010/wordprocessingDrawing" xmlns:wp="http://schemas.openxmlformats.org/drawingml/2006/wordprocessingDrawing" xmlns:w10="urn:schemas-microsoft-com:office:word" xmlns:w="http://schemas.openxmlformats.org/wordprocessingml/2006/main" xmlns:w14="http://schemas.microsoft.com/office/word/2010/wordml" xmlns:w15="http://schemas.microsoft.com/office/word/2012/wordml" xmlns:w16cex="http://schemas.microsoft.com/office/word/2018/wordml/cex" xmlns:w16cid="http://schemas.microsoft.com/office/word/2016/wordml/cid" xmlns:w16="http://schemas.microsoft.com/office/word/2018/wordml" xmlns:w16du="http://schemas.microsoft.com/office/word/2023/wordml/word16du" xmlns:w16sdtdh="http://schemas.microsoft.com/office/word/2020/wordml/sdtdatahash" xmlns:w16se="http://schemas.microsoft.com/office/word/2015/wordml/symex" xmlns:wpg="http://schemas.microsoft.com/office/word/2010/wordprocessingGroup" xmlns:wpi="http://schemas.microsoft.com/office/word/2010/wordprocessingInk" xmlns:wne="http://schemas.microsoft.com/office/word/2006/wordml" xmlns:wps="http://schemas.microsoft.com/office/word/2010/wordprocessingShape" mc:Ignorable="w14 w15 w16se w16cid w16 w16cex w16sdtdh w16du wp14">
+<w:hdr xmlns:wpc="http://schemas.microsoft.com/office/word/2010/wordprocessingCanvas" xmlns:cx="http://schemas.microsoft.com/office/drawing/2014/chartex" xmlns:cx1="http://schemas.microsoft.com/office/drawing/2015/9/8/chartex" xmlns:cx2="http://schemas.microsoft.com/office/drawing/2015/10/21/chartex" xmlns:cx3="http://schemas.microsoft.com/office/drawing/2016/5/9/chartex" xmlns:cx4="http://schemas.microsoft.com/office/drawing/2016/5/10/chartex" xmlns:cx5="http://schemas.microsoft.com/office/drawing/2016/5/11/chartex" xmlns:cx6="http://schemas.microsoft.com/office/drawing/2016/5/12/chartex" xmlns:cx7="http://schemas.microsoft.com/office/drawing/2016/5/13/chartex" xmlns:cx8="http://schemas.microsoft.com/office/drawing/2016/5/14/chartex" xmlns:mc="http://schemas.openxmlformats.org/markup-compatibility/2006" xmlns:aink="http://schemas.microsoft.com/office/drawing/2016/ink" xmlns:am3d="http://schemas.microsoft.com/office/drawing/2017/model3d" xmlns:o="urn:schemas-microsoft-com:office:office" xmlns:oel="http://schemas.microsoft.com/office/2019/extlst" xmlns:r="http://schemas.openxmlformats.org/officeDocument/2006/relationships" xmlns:m="http://schemas.openxmlformats.org/officeDocument/2006/math" xmlns:v="urn:schemas-microsoft-com:vml" xmlns:wp14="http://schemas.microsoft.com/office/word/2010/wordprocessingDrawing" xmlns:wp="http://schemas.openxmlformats.org/drawingml/2006/wordprocessingDrawing" xmlns:w10="urn:schemas-microsoft-com:office:word" xmlns:w="http://schemas.openxmlformats.org/wordprocessingml/2006/main" xmlns:w14="http://schemas.microsoft.com/office/word/2010/wordml" xmlns:w15="http://schemas.microsoft.com/office/word/2012/wordml" xmlns:w16cex="http://schemas.microsoft.com/office/word/2018/wordml/cex" xmlns:w16cid="http://schemas.microsoft.com/office/word/2016/wordml/cid" xmlns:w16="http://schemas.microsoft.com/office/word/2018/wordml" xmlns:w16du="http://schemas.microsoft.com/office/word/2023/wordml/word16du" xmlns:w16sdtdh="http://schemas.microsoft.com/office/word/2020/wordml/sdtdatahash" xmlns:w16sdtfl="http://schemas.microsoft.com/office/word/2024/wordml/sdtformatlock" xmlns:w16se="http://schemas.microsoft.com/office/word/2015/wordml/symex" xmlns:wpg="http://schemas.microsoft.com/office/word/2010/wordprocessingGroup" xmlns:wpi="http://schemas.microsoft.com/office/word/2010/wordprocessingInk" xmlns:wne="http://schemas.microsoft.com/office/word/2006/wordml" xmlns:wps="http://schemas.microsoft.com/office/word/2010/wordprocessingShape" mc:Ignorable="w14 w15 w16se w16cid w16 w16cex w16sdtdh w16sdtfl w16du wp14">
+  <w:p>
+    <w:pPr>
+      <w:pStyle w:val="Header"/>
+    </w:pPr>
+  </w:p>
+</w:hdr>
+</file>
+
+<file path=word/header2.xml><?xml version="1.0" encoding="utf-8"?>
+<w:hdr xmlns:wpc="http://schemas.microsoft.com/office/word/2010/wordprocessingCanvas" xmlns:cx="http://schemas.microsoft.com/office/drawing/2014/chartex" xmlns:cx1="http://schemas.microsoft.com/office/drawing/2015/9/8/chartex" xmlns:cx2="http://schemas.microsoft.com/office/drawing/2015/10/21/chartex" xmlns:cx3="http://schemas.microsoft.com/office/drawing/2016/5/9/chartex" xmlns:cx4="http://schemas.microsoft.com/office/drawing/2016/5/10/chartex" xmlns:cx5="http://schemas.microsoft.com/office/drawing/2016/5/11/chartex" xmlns:cx6="http://schemas.microsoft.com/office/drawing/2016/5/12/chartex" xmlns:cx7="http://schemas.microsoft.com/office/drawing/2016/5/13/chartex" xmlns:cx8="http://schemas.microsoft.com/office/drawing/2016/5/14/chartex" xmlns:mc="http://schemas.openxmlformats.org/markup-compatibility/2006" xmlns:aink="http://schemas.microsoft.com/office/drawing/2016/ink" xmlns:am3d="http://schemas.microsoft.com/office/drawing/2017/model3d" xmlns:o="urn:schemas-microsoft-com:office:office" xmlns:oel="http://schemas.microsoft.com/office/2019/extlst" xmlns:r="http://schemas.openxmlformats.org/officeDocument/2006/relationships" xmlns:m="http://schemas.openxmlformats.org/officeDocument/2006/math" xmlns:v="urn:schemas-microsoft-com:vml" xmlns:wp14="http://schemas.microsoft.com/office/word/2010/wordprocessingDrawing" xmlns:wp="http://schemas.openxmlformats.org/drawingml/2006/wordprocessingDrawing" xmlns:w10="urn:schemas-microsoft-com:office:word" xmlns:w="http://schemas.openxmlformats.org/wordprocessingml/2006/main" xmlns:w14="http://schemas.microsoft.com/office/word/2010/wordml" xmlns:w15="http://schemas.microsoft.com/office/word/2012/wordml" xmlns:w16cex="http://schemas.microsoft.com/office/word/2018/wordml/cex" xmlns:w16cid="http://schemas.microsoft.com/office/word/2016/wordml/cid" xmlns:w16="http://schemas.microsoft.com/office/word/2018/wordml" xmlns:w16du="http://schemas.microsoft.com/office/word/2023/wordml/word16du" xmlns:w16sdtdh="http://schemas.microsoft.com/office/word/2020/wordml/sdtdatahash" xmlns:w16sdtfl="http://schemas.microsoft.com/office/word/2024/wordml/sdtformatlock" xmlns:w16se="http://schemas.microsoft.com/office/word/2015/wordml/symex" xmlns:wpg="http://schemas.microsoft.com/office/word/2010/wordprocessingGroup" xmlns:wpi="http://schemas.microsoft.com/office/word/2010/wordprocessingInk" xmlns:wne="http://schemas.microsoft.com/office/word/2006/wordml" xmlns:wps="http://schemas.microsoft.com/office/word/2010/wordprocessingShape" mc:Ignorable="w14 w15 w16se w16cid w16 w16cex w16sdtdh w16sdtfl w16du wp14">
   <w:p>
     <w:pPr>
       <w:widowControl w:val="0"/>
@@ -4314,12 +4643,11 @@
   <w:tbl>
     <w:tblPr>
       <w:tblStyle w:val="a0"/>
-      <w:tblW w:w="9360" w:type="dxa"/>
+      <w:tblW w:w="6240" w:type="dxa"/>
       <w:tblLayout w:type="fixed"/>
       <w:tblLook w:val="0600" w:firstRow="0" w:lastRow="0" w:firstColumn="0" w:lastColumn="0" w:noHBand="1" w:noVBand="1"/>
     </w:tblPr>
     <w:tblGrid>
-      <w:gridCol w:w="3120"/>
       <w:gridCol w:w="3120"/>
       <w:gridCol w:w="3120"/>
     </w:tblGrid>
@@ -4344,57 +4672,16 @@
               <w:tab w:val="center" w:pos="4680"/>
               <w:tab w:val="right" w:pos="9360"/>
             </w:tabs>
-            <w:ind w:left="-115"/>
             <w:rPr>
-              <w:b/>
               <w:color w:val="000000"/>
             </w:rPr>
           </w:pPr>
           <w:r>
             <w:rPr>
-              <w:b/>
               <w:color w:val="000000"/>
             </w:rPr>
-            <w:t>Spring</w:t>
+            <w:t>Spring 2026</w:t>
           </w:r>
-          <w:r>
-            <w:rPr>
-              <w:b/>
-              <w:color w:val="000000"/>
-            </w:rPr>
-            <w:t xml:space="preserve"> 202</w:t>
-          </w:r>
-          <w:r>
-            <w:rPr>
-              <w:b/>
-              <w:color w:val="000000"/>
-            </w:rPr>
-            <w:t>5</w:t>
-          </w:r>
-        </w:p>
-      </w:tc>
-      <w:tc>
-        <w:tcPr>
-          <w:tcW w:w="3120" w:type="dxa"/>
-        </w:tcPr>
-        <w:p>
-          <w:pPr>
-            <w:pBdr>
-              <w:top w:val="nil"/>
-              <w:left w:val="nil"/>
-              <w:bottom w:val="nil"/>
-              <w:right w:val="nil"/>
-              <w:between w:val="nil"/>
-            </w:pBdr>
-            <w:tabs>
-              <w:tab w:val="center" w:pos="4680"/>
-              <w:tab w:val="right" w:pos="9360"/>
-            </w:tabs>
-            <w:jc w:val="center"/>
-            <w:rPr>
-              <w:color w:val="000000"/>
-            </w:rPr>
-          </w:pPr>
         </w:p>
       </w:tc>
       <w:tc>
@@ -4446,8 +4733,18 @@
 </w:hdr>
 </file>
 
+<file path=word/header3.xml><?xml version="1.0" encoding="utf-8"?>
+<w:hdr xmlns:wpc="http://schemas.microsoft.com/office/word/2010/wordprocessingCanvas" xmlns:cx="http://schemas.microsoft.com/office/drawing/2014/chartex" xmlns:cx1="http://schemas.microsoft.com/office/drawing/2015/9/8/chartex" xmlns:cx2="http://schemas.microsoft.com/office/drawing/2015/10/21/chartex" xmlns:cx3="http://schemas.microsoft.com/office/drawing/2016/5/9/chartex" xmlns:cx4="http://schemas.microsoft.com/office/drawing/2016/5/10/chartex" xmlns:cx5="http://schemas.microsoft.com/office/drawing/2016/5/11/chartex" xmlns:cx6="http://schemas.microsoft.com/office/drawing/2016/5/12/chartex" xmlns:cx7="http://schemas.microsoft.com/office/drawing/2016/5/13/chartex" xmlns:cx8="http://schemas.microsoft.com/office/drawing/2016/5/14/chartex" xmlns:mc="http://schemas.openxmlformats.org/markup-compatibility/2006" xmlns:aink="http://schemas.microsoft.com/office/drawing/2016/ink" xmlns:am3d="http://schemas.microsoft.com/office/drawing/2017/model3d" xmlns:o="urn:schemas-microsoft-com:office:office" xmlns:oel="http://schemas.microsoft.com/office/2019/extlst" xmlns:r="http://schemas.openxmlformats.org/officeDocument/2006/relationships" xmlns:m="http://schemas.openxmlformats.org/officeDocument/2006/math" xmlns:v="urn:schemas-microsoft-com:vml" xmlns:wp14="http://schemas.microsoft.com/office/word/2010/wordprocessingDrawing" xmlns:wp="http://schemas.openxmlformats.org/drawingml/2006/wordprocessingDrawing" xmlns:w10="urn:schemas-microsoft-com:office:word" xmlns:w="http://schemas.openxmlformats.org/wordprocessingml/2006/main" xmlns:w14="http://schemas.microsoft.com/office/word/2010/wordml" xmlns:w15="http://schemas.microsoft.com/office/word/2012/wordml" xmlns:w16cex="http://schemas.microsoft.com/office/word/2018/wordml/cex" xmlns:w16cid="http://schemas.microsoft.com/office/word/2016/wordml/cid" xmlns:w16="http://schemas.microsoft.com/office/word/2018/wordml" xmlns:w16du="http://schemas.microsoft.com/office/word/2023/wordml/word16du" xmlns:w16sdtdh="http://schemas.microsoft.com/office/word/2020/wordml/sdtdatahash" xmlns:w16sdtfl="http://schemas.microsoft.com/office/word/2024/wordml/sdtformatlock" xmlns:w16se="http://schemas.microsoft.com/office/word/2015/wordml/symex" xmlns:wpg="http://schemas.microsoft.com/office/word/2010/wordprocessingGroup" xmlns:wpi="http://schemas.microsoft.com/office/word/2010/wordprocessingInk" xmlns:wne="http://schemas.microsoft.com/office/word/2006/wordml" xmlns:wps="http://schemas.microsoft.com/office/word/2010/wordprocessingShape" mc:Ignorable="w14 w15 w16se w16cid w16 w16cex w16sdtdh w16sdtfl w16du wp14">
+  <w:p>
+    <w:pPr>
+      <w:pStyle w:val="Header"/>
+    </w:pPr>
+  </w:p>
+</w:hdr>
+</file>
+
 <file path=word/numbering.xml><?xml version="1.0" encoding="utf-8"?>
-<w:numbering xmlns:wpc="http://schemas.microsoft.com/office/word/2010/wordprocessingCanvas" xmlns:cx="http://schemas.microsoft.com/office/drawing/2014/chartex" xmlns:cx1="http://schemas.microsoft.com/office/drawing/2015/9/8/chartex" xmlns:cx2="http://schemas.microsoft.com/office/drawing/2015/10/21/chartex" xmlns:cx3="http://schemas.microsoft.com/office/drawing/2016/5/9/chartex" xmlns:cx4="http://schemas.microsoft.com/office/drawing/2016/5/10/chartex" xmlns:cx5="http://schemas.microsoft.com/office/drawing/2016/5/11/chartex" xmlns:cx6="http://schemas.microsoft.com/office/drawing/2016/5/12/chartex" xmlns:cx7="http://schemas.microsoft.com/office/drawing/2016/5/13/chartex" xmlns:cx8="http://schemas.microsoft.com/office/drawing/2016/5/14/chartex" xmlns:mc="http://schemas.openxmlformats.org/markup-compatibility/2006" xmlns:aink="http://schemas.microsoft.com/office/drawing/2016/ink" xmlns:am3d="http://schemas.microsoft.com/office/drawing/2017/model3d" xmlns:o="urn:schemas-microsoft-com:office:office" xmlns:oel="http://schemas.microsoft.com/office/2019/extlst" xmlns:r="http://schemas.openxmlformats.org/officeDocument/2006/relationships" xmlns:m="http://schemas.openxmlformats.org/officeDocument/2006/math" xmlns:v="urn:schemas-microsoft-com:vml" xmlns:wp14="http://schemas.microsoft.com/office/word/2010/wordprocessingDrawing" xmlns:wp="http://schemas.openxmlformats.org/drawingml/2006/wordprocessingDrawing" xmlns:w10="urn:schemas-microsoft-com:office:word" xmlns:w="http://schemas.openxmlformats.org/wordprocessingml/2006/main" xmlns:w14="http://schemas.microsoft.com/office/word/2010/wordml" xmlns:w15="http://schemas.microsoft.com/office/word/2012/wordml" xmlns:w16cex="http://schemas.microsoft.com/office/word/2018/wordml/cex" xmlns:w16cid="http://schemas.microsoft.com/office/word/2016/wordml/cid" xmlns:w16="http://schemas.microsoft.com/office/word/2018/wordml" xmlns:w16du="http://schemas.microsoft.com/office/word/2023/wordml/word16du" xmlns:w16sdtdh="http://schemas.microsoft.com/office/word/2020/wordml/sdtdatahash" xmlns:w16se="http://schemas.microsoft.com/office/word/2015/wordml/symex" xmlns:wpg="http://schemas.microsoft.com/office/word/2010/wordprocessingGroup" xmlns:wpi="http://schemas.microsoft.com/office/word/2010/wordprocessingInk" xmlns:wne="http://schemas.microsoft.com/office/word/2006/wordml" xmlns:wps="http://schemas.microsoft.com/office/word/2010/wordprocessingShape" mc:Ignorable="w14 w15 w16se w16cid w16 w16cex w16sdtdh w16du wp14">
+<w:numbering xmlns:wpc="http://schemas.microsoft.com/office/word/2010/wordprocessingCanvas" xmlns:cx="http://schemas.microsoft.com/office/drawing/2014/chartex" xmlns:cx1="http://schemas.microsoft.com/office/drawing/2015/9/8/chartex" xmlns:cx2="http://schemas.microsoft.com/office/drawing/2015/10/21/chartex" xmlns:cx3="http://schemas.microsoft.com/office/drawing/2016/5/9/chartex" xmlns:cx4="http://schemas.microsoft.com/office/drawing/2016/5/10/chartex" xmlns:cx5="http://schemas.microsoft.com/office/drawing/2016/5/11/chartex" xmlns:cx6="http://schemas.microsoft.com/office/drawing/2016/5/12/chartex" xmlns:cx7="http://schemas.microsoft.com/office/drawing/2016/5/13/chartex" xmlns:cx8="http://schemas.microsoft.com/office/drawing/2016/5/14/chartex" xmlns:mc="http://schemas.openxmlformats.org/markup-compatibility/2006" xmlns:aink="http://schemas.microsoft.com/office/drawing/2016/ink" xmlns:am3d="http://schemas.microsoft.com/office/drawing/2017/model3d" xmlns:o="urn:schemas-microsoft-com:office:office" xmlns:oel="http://schemas.microsoft.com/office/2019/extlst" xmlns:r="http://schemas.openxmlformats.org/officeDocument/2006/relationships" xmlns:m="http://schemas.openxmlformats.org/officeDocument/2006/math" xmlns:v="urn:schemas-microsoft-com:vml" xmlns:wp14="http://schemas.microsoft.com/office/word/2010/wordprocessingDrawing" xmlns:wp="http://schemas.openxmlformats.org/drawingml/2006/wordprocessingDrawing" xmlns:w10="urn:schemas-microsoft-com:office:word" xmlns:w="http://schemas.openxmlformats.org/wordprocessingml/2006/main" xmlns:w14="http://schemas.microsoft.com/office/word/2010/wordml" xmlns:w15="http://schemas.microsoft.com/office/word/2012/wordml" xmlns:w16cex="http://schemas.microsoft.com/office/word/2018/wordml/cex" xmlns:w16cid="http://schemas.microsoft.com/office/word/2016/wordml/cid" xmlns:w16="http://schemas.microsoft.com/office/word/2018/wordml" xmlns:w16du="http://schemas.microsoft.com/office/word/2023/wordml/word16du" xmlns:w16sdtdh="http://schemas.microsoft.com/office/word/2020/wordml/sdtdatahash" xmlns:w16sdtfl="http://schemas.microsoft.com/office/word/2024/wordml/sdtformatlock" xmlns:w16se="http://schemas.microsoft.com/office/word/2015/wordml/symex" xmlns:wpg="http://schemas.microsoft.com/office/word/2010/wordprocessingGroup" xmlns:wpi="http://schemas.microsoft.com/office/word/2010/wordprocessingInk" xmlns:wne="http://schemas.microsoft.com/office/word/2006/wordml" xmlns:wps="http://schemas.microsoft.com/office/word/2010/wordprocessingShape" mc:Ignorable="w14 w15 w16se w16cid w16 w16cex w16sdtdh w16sdtfl w16du wp14">
   <w:abstractNum w:abstractNumId="0" w15:restartNumberingAfterBreak="0">
     <w:nsid w:val="00E9E674"/>
     <w:multiLevelType w:val="multilevel"/>
@@ -5682,7 +5979,7 @@
 </file>
 
 <file path=word/styles.xml><?xml version="1.0" encoding="utf-8"?>
-<w:styles xmlns:mc="http://schemas.openxmlformats.org/markup-compatibility/2006" xmlns:r="http://schemas.openxmlformats.org/officeDocument/2006/relationships" xmlns:w="http://schemas.openxmlformats.org/wordprocessingml/2006/main" xmlns:w14="http://schemas.microsoft.com/office/word/2010/wordml" xmlns:w15="http://schemas.microsoft.com/office/word/2012/wordml" xmlns:w16cex="http://schemas.microsoft.com/office/word/2018/wordml/cex" xmlns:w16cid="http://schemas.microsoft.com/office/word/2016/wordml/cid" xmlns:w16="http://schemas.microsoft.com/office/word/2018/wordml" xmlns:w16du="http://schemas.microsoft.com/office/word/2023/wordml/word16du" xmlns:w16sdtdh="http://schemas.microsoft.com/office/word/2020/wordml/sdtdatahash" xmlns:w16se="http://schemas.microsoft.com/office/word/2015/wordml/symex" mc:Ignorable="w14 w15 w16se w16cid w16 w16cex w16sdtdh w16du">
+<w:styles xmlns:mc="http://schemas.openxmlformats.org/markup-compatibility/2006" xmlns:r="http://schemas.openxmlformats.org/officeDocument/2006/relationships" xmlns:w="http://schemas.openxmlformats.org/wordprocessingml/2006/main" xmlns:w14="http://schemas.microsoft.com/office/word/2010/wordml" xmlns:w15="http://schemas.microsoft.com/office/word/2012/wordml" xmlns:w16cex="http://schemas.microsoft.com/office/word/2018/wordml/cex" xmlns:w16cid="http://schemas.microsoft.com/office/word/2016/wordml/cid" xmlns:w16="http://schemas.microsoft.com/office/word/2018/wordml" xmlns:w16du="http://schemas.microsoft.com/office/word/2023/wordml/word16du" xmlns:w16sdtdh="http://schemas.microsoft.com/office/word/2020/wordml/sdtdatahash" xmlns:w16sdtfl="http://schemas.microsoft.com/office/word/2024/wordml/sdtformatlock" xmlns:w16se="http://schemas.microsoft.com/office/word/2015/wordml/symex" mc:Ignorable="w14 w15 w16se w16cid w16 w16cex w16sdtdh w16sdtfl w16du">
   <w:docDefaults>
     <w:rPrDefault>
       <w:rPr>
@@ -6491,6 +6788,18 @@
       <w:tblStyleColBandSize w:val="1"/>
     </w:tblPr>
   </w:style>
+  <w:style w:type="character" w:styleId="UnresolvedMention">
+    <w:name w:val="Unresolved Mention"/>
+    <w:basedOn w:val="DefaultParagraphFont"/>
+    <w:uiPriority w:val="99"/>
+    <w:semiHidden/>
+    <w:unhideWhenUsed/>
+    <w:rsid w:val="00735602"/>
+    <w:rPr>
+      <w:color w:val="605E5C"/>
+      <w:shd w:val="clear" w:color="auto" w:fill="E1DFDD"/>
+    </w:rPr>
+  </w:style>
 </w:styles>
 </file>
 

</xml_diff>